<commit_message>
Deploying to gh-pages from @ volodya-lombrozo/newsman@5118909942d07dc04bab83d677bfe709c9ffc0b3 🚀
</commit_message>
<xml_diff>
--- a/2026/09/07/07.09.2026.volodya-lombrozo.gpt-5-6.docx
+++ b/2026/09/07/07.09.2026.volodya-lombrozo.gpt-5-6.docx
@@ -34,6 +34,9 @@
       </w:r>
     </w:p>
     <w:p>
+      <w:pPr>
+        <w:pStyle w:val="Heading2"/>
+      </w:pPr>
       <w:r>
         <w:rPr>
           <w:rFonts w:ascii="Times New Roman" w:hAnsi="Times New Roman" w:cs="Times New Roman"/>
@@ -44,6 +47,9 @@
       </w:r>
     </w:p>
     <w:p>
+      <w:pPr>
+        <w:pStyle w:val="Heading3"/>
+      </w:pPr>
       <w:r>
         <w:rPr>
           <w:rFonts w:ascii="Times New Roman" w:hAnsi="Times New Roman" w:cs="Times New Roman"/>
@@ -66,7 +72,7 @@
           <w:sz w:val="24"/>
           <w:szCs w:val="24"/>
         </w:rPr>
-        <w:t xml:space="preserve">Migrated LtUnlintNonExistingDefect tests to pack format [#1349]</w:t>
+        <w:t xml:space="preserve">Migrated LtUnlintNonExistingDefect tests to the pack format [#1349]</w:t>
       </w:r>
     </w:p>
     <w:p>
@@ -150,6 +156,9 @@
       </w:r>
     </w:p>
     <w:p>
+      <w:pPr>
+        <w:pStyle w:val="Heading2"/>
+      </w:pPr>
       <w:r>
         <w:rPr>
           <w:rFonts w:ascii="Times New Roman" w:hAnsi="Times New Roman" w:cs="Times New Roman"/>
@@ -160,6 +169,9 @@
       </w:r>
     </w:p>
     <w:p>
+      <w:pPr>
+        <w:pStyle w:val="Heading2"/>
+      </w:pPr>
       <w:r>
         <w:rPr>
           <w:rFonts w:ascii="Times New Roman" w:hAnsi="Times New Roman" w:cs="Times New Roman"/>
@@ -170,6 +182,9 @@
       </w:r>
     </w:p>
     <w:p>
+      <w:pPr>
+        <w:pStyle w:val="Heading3"/>
+      </w:pPr>
       <w:r>
         <w:rPr>
           <w:rFonts w:ascii="Times New Roman" w:hAnsi="Times New Roman" w:cs="Times New Roman"/>
@@ -453,7 +468,7 @@
           <w:sz w:val="24"/>
           <w:szCs w:val="24"/>
         </w:rPr>
-        <w:t xml:space="preserve">Issues reviewed: 38 (labeled/assigned), 12 closed</w:t>
+        <w:t xml:space="preserve">Issues reviewed: 39 (labeled/assigned), 14 closed</w:t>
       </w:r>
       <w:r>
         <w:br/>

</xml_diff>